<commit_message>
fix: convertir todos los montos del libro de pesos colombianos a dolares USD
Para que el libro sea consistente y vendible globalmente, todos los
ejemplos numericos (casos practicos, tabla de proyeccion financiera,
comparaciones de contratos) ahora usan USD en vez de COP.

Co-Authored-By: Claude Sonnet 5 <noreply@anthropic.com>
Claude-Session: https://claude.ai/code/session_01BGajP5s9F1aLgfyztSAp9Y
</commit_message>
<xml_diff>
--- a/docs/libro/Music_Business_Para_Todos_IM_Music.docx
+++ b/docs/libro/Music_Business_Para_Todos_IM_Music.docx
@@ -1356,19 +1356,19 @@
           <w:rFonts w:ascii="Georgia" w:hAnsi="Georgia"/>
           <w:sz w:val="22"/>
         </w:rPr>
-        <w:t>*Artista A* firma con el primer sello que le ofrece contrato, cediendo el 80% de sus regalías y los derechos de master por diez años, porque "por fin alguien cree en mí". El sello le da un presupuesto de video de $8 millones de pesos. Ese dinero entra en recoupment. Dieciocho meses después, la canción generó $12 millones en regalías — pero el artista no ha visto un peso, porque el sello sigue recuperando su inversión inicial más los costos de marketing que fue sumando en el camino.</w:t>
-      </w:r>
-    </w:p>
-    <w:p>
-      <w:pPr>
-        <w:spacing w:after="160"/>
-      </w:pPr>
-      <w:r>
-        <w:rPr>
-          <w:rFonts w:ascii="Georgia" w:hAnsi="Georgia"/>
-          <w:sz w:val="22"/>
-        </w:rPr>
-        <w:t>*Artista B* se distribuye de forma independiente, se queda con el 100% de sus derechos, invierte $1.5 millones de su bolsillo en producción y contenido, y reinvierte cada peso que genera en más contenido. Genera menos en términos absolutos el primer año — pero cada peso es suyo, sin negociación, sin recoupment, sin cláusulas ocultas. Al año siguiente, con el catálogo y la audiencia ya construidos, negocia una alianza de distribución con mejores términos porque ya tiene apalancamiento propio: audiencia real, no una promesa.</w:t>
+        <w:t>*Artista A* firma con el primer sello que le ofrece contrato, cediendo el 80% de sus regalías y los derechos de master por diez años, porque "por fin alguien cree en mí". El sello le da un presupuesto de video de $2,000 USD. Ese dinero entra en recoupment. Dieciocho meses después, la canción generó $3,000 USD en regalías — pero el artista no ha visto un dólar, porque el sello sigue recuperando su inversión inicial más los costos de marketing que fue sumando en el camino.</w:t>
+      </w:r>
+    </w:p>
+    <w:p>
+      <w:pPr>
+        <w:spacing w:after="160"/>
+      </w:pPr>
+      <w:r>
+        <w:rPr>
+          <w:rFonts w:ascii="Georgia" w:hAnsi="Georgia"/>
+          <w:sz w:val="22"/>
+        </w:rPr>
+        <w:t>*Artista B* se distribuye de forma independiente, se queda con el 100% de sus derechos, invierte $400 USD de su bolsillo en producción y contenido, y reinvierte cada dólar que genera en más contenido. Genera menos en términos absolutos el primer año — pero cada dólar es suyo, sin negociación, sin recoupment, sin cláusulas ocultas. Al año siguiente, con el catálogo y la audiencia ya construidos, negocia una alianza de distribución con mejores términos porque ya tiene apalancamiento propio: audiencia real, no una promesa.</w:t>
       </w:r>
     </w:p>
     <w:p>
@@ -3030,7 +3030,7 @@
           <w:rFonts w:ascii="Georgia" w:hAnsi="Georgia"/>
           <w:sz w:val="22"/>
         </w:rPr>
-        <w:t>Un restaurante en Medellín pone música en vivo todos los fines de semana, incluyendo canciones de artistas locales independientes, y nunca ha pagado un peso de regalías de comunicación pública. Técnicamente, ese establecimiento debería tener una licencia de SAYCO que cubra el uso de música con derechos de autor en su local — y esa licencia genera un fondo que se reparte entre los compositores afiliados cuya música efectivamente sonó ahí (via reportes de programación, cuando existen, o de forma proporcional según el repertorio general).</w:t>
+        <w:t>Un restaurante en Medellín pone música en vivo todos los fines de semana, incluyendo canciones de artistas locales independientes, y nunca ha pagado un centavo de regalías de comunicación pública. Técnicamente, ese establecimiento debería tener una licencia de SAYCO que cubra el uso de música con derechos de autor en su local — y esa licencia genera un fondo que se reparte entre los compositores afiliados cuya música efectivamente sonó ahí (via reportes de programación, cuando existen, o de forma proporcional según el repertorio general).</w:t>
       </w:r>
     </w:p>
     <w:p>
@@ -5313,19 +5313,19 @@
           <w:rFonts w:ascii="Georgia" w:hAnsi="Georgia"/>
           <w:sz w:val="22"/>
         </w:rPr>
-        <w:t>Un artista que genera $2,000,000 de pesos al año en regalías tiene dos opciones: un distribuidor de suscripción fija a $150,000 pesos/año (se queda con el 100% de sus regalías, paga la tarifa fija sin importar cuánto genere), o un distribuidor de comisión del 15% sin costo fijo. En el modelo de suscripción, el costo total anual es de $150,000 pesos. En el modelo de comisión, el costo es de $300,000 pesos (15% de $2,000,000). Para este nivel de ingresos, la suscripción fija resulta más barata.</w:t>
-      </w:r>
-    </w:p>
-    <w:p>
-      <w:pPr>
-        <w:spacing w:after="160"/>
-      </w:pPr>
-      <w:r>
-        <w:rPr>
-          <w:rFonts w:ascii="Georgia" w:hAnsi="Georgia"/>
-          <w:sz w:val="22"/>
-        </w:rPr>
-        <w:t>Pero si ese mismo artista solo genera $500,000 pesos al año, la comisión del 15% cuesta $75,000 pesos — más barata que la suscripción fija de $150,000. El modelo correcto depende directamente del volumen de ingresos esperado, y por eso conviene proyectar (aunque sea de forma aproximada) antes de comprometerse con un distribuidor a largo plazo.</w:t>
+        <w:t>Un artista que genera $500 USD al año en regalías tiene dos opciones: un distribuidor de suscripción fija a $35 USD/año (se queda con el 100% de sus regalías, paga la tarifa fija sin importar cuánto genere), o un distribuidor de comisión del 15% sin costo fijo. En el modelo de suscripción, el costo total anual es de $35 USD. En el modelo de comisión, el costo es de $75 USD (15% de $500). Para este nivel de ingresos, la suscripción fija resulta más barata.</w:t>
+      </w:r>
+    </w:p>
+    <w:p>
+      <w:pPr>
+        <w:spacing w:after="160"/>
+      </w:pPr>
+      <w:r>
+        <w:rPr>
+          <w:rFonts w:ascii="Georgia" w:hAnsi="Georgia"/>
+          <w:sz w:val="22"/>
+        </w:rPr>
+        <w:t>Pero si ese mismo artista solo genera $150 USD al año, la comisión del 15% cuesta $22.50 USD — más barata que la suscripción fija de $35. El modelo correcto depende directamente del volumen de ingresos esperado, y por eso conviene proyectar (aunque sea de forma aproximada) antes de comprometerse con un distribuidor a largo plazo.</w:t>
       </w:r>
     </w:p>
     <w:p>
@@ -5534,7 +5534,7 @@
           <w:rFonts w:ascii="Georgia" w:hAnsi="Georgia"/>
           <w:sz w:val="22"/>
         </w:rPr>
-        <w:t>Esta transparencia es, en sí misma, el verdadero valor agregado: no es solo un número más bajo, es un modelo de negocio que le explica al artista exactamente de dónde sale cada peso — un estándar que cualquier artista, en cualquier país, debería exigir de quien distribuya su música.</w:t>
+        <w:t>Esta transparencia es, en sí misma, el verdadero valor agregado: no es solo un número más bajo, es un modelo de negocio que le explica al artista exactamente de dónde sale cada dólar — un estándar que cualquier artista, en cualquier país, debería exigir de quien distribuya su música.</w:t>
       </w:r>
     </w:p>
     <w:p>
@@ -5560,7 +5560,7 @@
           <w:rFonts w:ascii="Georgia" w:hAnsi="Georgia"/>
           <w:sz w:val="22"/>
         </w:rPr>
-        <w:t>Un artista genera el equivalente a $10,000,000 de pesos colombianos en regalías en un año a través de su música distribuida. Bajo un contrato de sello tradicional con comisión del 50%, ese artista recibiría $5,000,000. Bajo un modelo transparente de comisión baja (como el 92% de IM Music), recibiría $9,200,000 — una diferencia de $4,200,000 en un solo año, generados por exactamente la misma música, exactamente los mismos streams.</w:t>
+        <w:t>Un artista genera $2,500 USD en regalías en un año a través de su música distribuida. Bajo un contrato de sello tradicional con comisión del 50%, ese artista recibiría $1,250 USD. Bajo un modelo transparente de comisión baja (como el 92% de IM Music), recibiría $2,300 USD — una diferencia de $1,050 USD en un solo año, generados por exactamente la misma música, exactamente los mismos streams.</w:t>
       </w:r>
     </w:p>
     <w:p>
@@ -5839,7 +5839,7 @@
           <w:rFonts w:ascii="Georgia" w:hAnsi="Georgia"/>
           <w:sz w:val="22"/>
         </w:rPr>
-        <w:t>Si el sello invierte en tu producción, marketing o video, ¿ese dinero se descuenta de tus regalías futuras antes de que veas un peso? Esta es una de las cláusulas más importantes y menos entendidas del negocio — la desarrollamos a fondo más adelante.</w:t>
+        <w:t>Si el sello invierte en tu producción, marketing o video, ¿ese dinero se descuenta de tus regalías futuras antes de que veas un dólar? Esta es una de las cláusulas más importantes y menos entendidas del negocio — la desarrollamos a fondo más adelante.</w:t>
       </w:r>
     </w:p>
     <w:p>
@@ -5917,7 +5917,7 @@
           <w:rFonts w:ascii="Georgia" w:hAnsi="Georgia"/>
           <w:sz w:val="22"/>
         </w:rPr>
-        <w:t>Cuando un sello dice "te vamos a pagar 20% de regalías", esa cifra suena bien hasta que entiendes el recoupment: antes de que veas un solo peso de esas regalías, el sello primero se cobra a sí mismo todo lo que invirtió en ti (producción, videos, marketing, adelantos). Solo después de que esa inversión se "recupera" completamente, empiezas a recibir tu porcentaje. Un contrato de "20% de regalías" con una inversión de $50 millones de pesos sin recuperar puede significar años sin ver un peso, aunque tu música esté generando ingresos activamente.</w:t>
+        <w:t>Cuando un sello dice "te vamos a pagar 20% de regalías", esa cifra suena bien hasta que entiendes el recoupment: antes de que veas un solo dólar de esas regalías, el sello primero se cobra a sí mismo todo lo que invirtió en ti (producción, videos, marketing, adelantos). Solo después de que esa inversión se "recupera" completamente, empiezas a recibir tu porcentaje. Un contrato de "20% de regalías" con una inversión de $12,000 USD sin recuperar puede significar años sin ver un dólar, aunque tu música esté generando ingresos activamente.</w:t>
       </w:r>
     </w:p>
     <w:p>
@@ -5955,19 +5955,19 @@
           <w:rFonts w:ascii="Georgia" w:hAnsi="Georgia"/>
           <w:sz w:val="22"/>
         </w:rPr>
-        <w:t>Un sello ofrece a un artista un contrato con 25% de regalías y una inversión inicial de $30,000,000 de pesos en producción de álbum, video musical y campaña de marketing. El artista, entusiasmado, firma sin preguntar el detalle del recoupment. Un año después, su álbum generó $18,000,000 de pesos en regalías — pero como el sello aún no ha recuperado su inversión de $30,000,000, el artista no ha recibido ni un peso de ese 25% acordado.</w:t>
-      </w:r>
-    </w:p>
-    <w:p>
-      <w:pPr>
-        <w:spacing w:after="160"/>
-      </w:pPr>
-      <w:r>
-        <w:rPr>
-          <w:rFonts w:ascii="Georgia" w:hAnsi="Georgia"/>
-          <w:sz w:val="22"/>
-        </w:rPr>
-        <w:t>Ahora compara con un contrato negociado con transparencia: mismo 25% de regalías, misma inversión de $30,000,000 — pero con una cláusula que limita qué gastos entran en el recoupment (por ejemplo, excluyendo gastos de viaje o comidas que el sello quiera cargar de forma discrecional), y con reportes trimestrales obligatorios que muestran exactamente cuánto se ha recuperado. El resultado económico puede ser similar en el largo plazo, pero el artista sabe en todo momento dónde está parado — y puede verificar que los números sean correctos.</w:t>
+        <w:t>Un sello ofrece a un artista un contrato con 25% de regalías y una inversión inicial de $7,500 USD en producción de álbum, video musical y campaña de marketing. El artista, entusiasmado, firma sin preguntar el detalle del recoupment. Un año después, su álbum generó $4,500 USD en regalías — pero como el sello aún no ha recuperado su inversión de $7,500, el artista no ha recibido ni un dólar de ese 25% acordado.</w:t>
+      </w:r>
+    </w:p>
+    <w:p>
+      <w:pPr>
+        <w:spacing w:after="160"/>
+      </w:pPr>
+      <w:r>
+        <w:rPr>
+          <w:rFonts w:ascii="Georgia" w:hAnsi="Georgia"/>
+          <w:sz w:val="22"/>
+        </w:rPr>
+        <w:t>Ahora compara con un contrato negociado con transparencia: mismo 25% de regalías, misma inversión de $7,500 USD — pero con una cláusula que limita qué gastos entran en el recoupment (por ejemplo, excluyendo gastos de viaje o comidas que el sello quiera cargar de forma discrecional), y con reportes trimestrales obligatorios que muestran exactamente cuánto se ha recuperado. El resultado económico puede ser similar en el largo plazo, pero el artista sabe en todo momento dónde está parado — y puede verificar que los números sean correctos.</w:t>
       </w:r>
     </w:p>
     <w:p>
@@ -8808,7 +8808,7 @@
           <w:rFonts w:ascii="Georgia" w:hAnsi="Georgia"/>
           <w:sz w:val="22"/>
         </w:rPr>
-        <w:t>Un supervisor musical de una agencia de publicidad encuentra la canción de un artista independiente y quiere usarla en un comercial con presupuesto nacional — una oportunidad que podría representar varios millones de pesos en un solo pago. Contacta al artista con un plazo de 48 horas para confirmar disponibilidad de licencia. El artista no tiene claro quién es dueño de qué porcentaje de la composición (nunca formalizó el split con su productor), no tiene una versión instrumental lista, y tarda cuatro días en resolver la situación internamente. Para entonces, la agencia ya avanzó con otra canción, de otro artista que sí pudo responder en el plazo.</w:t>
+        <w:t>Un supervisor musical de una agencia de publicidad encuentra la canción de un artista independiente y quiere usarla en un comercial con presupuesto nacional — una oportunidad que podría representar varios miles de dólares en un solo pago. Contacta al artista con un plazo de 48 horas para confirmar disponibilidad de licencia. El artista no tiene claro quién es dueño de qué porcentaje de la composición (nunca formalizó el split con su productor), no tiene una versión instrumental lista, y tarda cuatro días en resolver la situación internamente. Para entonces, la agencia ya avanzó con otra canción, de otro artista que sí pudo responder en el plazo.</w:t>
       </w:r>
     </w:p>
     <w:p>
@@ -13085,7 +13085,7 @@
                 <w:color w:val="FFFFFF"/>
                 <w:sz w:val="20"/>
               </w:rPr>
-              <w:t>Costo estimado (COP/año)</w:t>
+              <w:t>Costo estimado (USD/año)</w:t>
             </w:r>
           </w:p>
         </w:tc>
@@ -13119,7 +13119,7 @@
                 <w:color w:val="222222"/>
                 <w:sz w:val="20"/>
               </w:rPr>
-              <w:t>$ 150,000</w:t>
+              <w:t>$ 40</w:t>
             </w:r>
           </w:p>
         </w:tc>
@@ -13153,7 +13153,7 @@
                 <w:color w:val="222222"/>
                 <w:sz w:val="20"/>
               </w:rPr>
-              <w:t>$ 3,600,000</w:t>
+              <w:t>$ 900</w:t>
             </w:r>
           </w:p>
         </w:tc>
@@ -13187,7 +13187,7 @@
                 <w:color w:val="222222"/>
                 <w:sz w:val="20"/>
               </w:rPr>
-              <w:t>$ 1,200,000</w:t>
+              <w:t>$ 300</w:t>
             </w:r>
           </w:p>
         </w:tc>
@@ -13205,7 +13205,7 @@
                 <w:color w:val="222222"/>
                 <w:sz w:val="20"/>
               </w:rPr>
-              <w:t>Registro de obras (DNDA, afiliación SAYCO/ACINPRO)</w:t>
+              <w:t>Registro de obras y afiliación a tu sociedad de gestión local</w:t>
             </w:r>
           </w:p>
         </w:tc>
@@ -13221,7 +13221,7 @@
                 <w:color w:val="222222"/>
                 <w:sz w:val="20"/>
               </w:rPr>
-              <w:t>$ 400,000</w:t>
+              <w:t>$ 100</w:t>
             </w:r>
           </w:p>
         </w:tc>
@@ -13255,7 +13255,7 @@
                 <w:color w:val="222222"/>
                 <w:sz w:val="20"/>
               </w:rPr>
-              <w:t>$ 600,000</w:t>
+              <w:t>$ 150</w:t>
             </w:r>
           </w:p>
         </w:tc>
@@ -13289,7 +13289,7 @@
                 <w:color w:val="222222"/>
                 <w:sz w:val="20"/>
               </w:rPr>
-              <w:t>$ 5,950,000</w:t>
+              <w:t>$ 1,490</w:t>
             </w:r>
           </w:p>
         </w:tc>
@@ -13372,7 +13372,7 @@
                 <w:color w:val="FFFFFF"/>
                 <w:sz w:val="20"/>
               </w:rPr>
-              <w:t>Ingreso estimado (COP/año)</w:t>
+              <w:t>Ingreso estimado (USD/año)</w:t>
             </w:r>
           </w:p>
         </w:tc>
@@ -13422,7 +13422,7 @@
                 <w:color w:val="222222"/>
                 <w:sz w:val="20"/>
               </w:rPr>
-              <w:t>$ 1,800,000</w:t>
+              <w:t>$ 450</w:t>
             </w:r>
           </w:p>
         </w:tc>
@@ -13440,7 +13440,7 @@
                 <w:color w:val="222222"/>
                 <w:sz w:val="20"/>
               </w:rPr>
-              <w:t>Regalías SAYCO (ejecución pública)</w:t>
+              <w:t>Regalías de ejecución pública (tu sociedad de gestión local)</w:t>
             </w:r>
           </w:p>
         </w:tc>
@@ -13472,7 +13472,7 @@
                 <w:color w:val="222222"/>
                 <w:sz w:val="20"/>
               </w:rPr>
-              <w:t>$ 150,000</w:t>
+              <w:t>$ 40</w:t>
             </w:r>
           </w:p>
         </w:tc>
@@ -13506,7 +13506,7 @@
                 <w:color w:val="222222"/>
                 <w:sz w:val="20"/>
               </w:rPr>
-              <w:t>$ 400,000 promedio por show</w:t>
+              <w:t>$ 100 promedio por show</w:t>
             </w:r>
           </w:p>
         </w:tc>
@@ -13522,7 +13522,7 @@
                 <w:color w:val="222222"/>
                 <w:sz w:val="20"/>
               </w:rPr>
-              <w:t>$ 1,000,000</w:t>
+              <w:t>$ 250</w:t>
             </w:r>
           </w:p>
         </w:tc>
@@ -13556,7 +13556,7 @@
                 <w:color w:val="222222"/>
                 <w:sz w:val="20"/>
               </w:rPr>
-              <w:t>50 unidades vendidas, margen neto $15,000 c/u</w:t>
+              <w:t>50 unidades vendidas, margen neto $3.80 c/u</w:t>
             </w:r>
           </w:p>
         </w:tc>
@@ -13572,7 +13572,7 @@
                 <w:color w:val="222222"/>
                 <w:sz w:val="20"/>
               </w:rPr>
-              <w:t>$ 750,000</w:t>
+              <w:t>$ 190</w:t>
             </w:r>
           </w:p>
         </w:tc>
@@ -13621,7 +13621,7 @@
                 <w:color w:val="222222"/>
                 <w:sz w:val="20"/>
               </w:rPr>
-              <w:t>$ 3,700,000</w:t>
+              <w:t>$ 930</w:t>
             </w:r>
           </w:p>
         </w:tc>
@@ -13651,7 +13651,7 @@
           <w:rFonts w:ascii="Georgia" w:hAnsi="Georgia"/>
           <w:sz w:val="22"/>
         </w:rPr>
-        <w:t>En este ejemplo conservador, el primer año cierra con un déficit aparente de aproximadamente $2,250,000 pesos (costos de $5,950,000 contra ingresos de $3,700,000). Esto NO significa que el proyecto sea un fracaso — significa que el primer año de cualquier negocio, incluido uno musical, suele ser una fase de inversión, no de retorno. Lo que importa es la tendencia: si el catálogo generado en el año 1 sigue generando streaming pasivo en el año 2 (sin nuevos costos de producción para esas canciones específicas), y si la audiencia construida reduce el costo de adquisición de atención para el contenido futuro, el año 2 debería mostrar una brecha mucho menor, o incluso superávit, sin necesidad de duplicar la inversión inicial.</w:t>
+        <w:t>En este ejemplo conservador, el primer año cierra con un déficit aparente de aproximadamente $560 USD (costos de $1,490 contra ingresos de $930). Esto NO significa que el proyecto sea un fracaso — significa que el primer año de cualquier negocio, incluido uno musical, suele ser una fase de inversión, no de retorno. Lo que importa es la tendencia: si el catálogo generado en el año 1 sigue generando streaming pasivo en el año 2 (sin nuevos costos de producción para esas canciones específicas), y si la audiencia construida reduce el costo de adquisición de atención para el contenido futuro, el año 2 debería mostrar una brecha mucho menor, o incluso superávit, sin necesidad de duplicar la inversión inicial.</w:t>
       </w:r>
     </w:p>
     <w:p>
@@ -14109,7 +14109,7 @@
           <w:rFonts w:ascii="Georgia" w:hAnsi="Georgia"/>
           <w:sz w:val="22"/>
         </w:rPr>
-        <w:t>IM Music es un sello discográfico independiente construido sobre una premisa simple: la industria musical no tiene que elegir entre autenticidad y estructura, entre cultura callejera y estrategia de negocio sofisticada. REBEL LUXURY es esa síntesis — identidad visual radical, contenido con densidad de valor real, y un modelo de distribución transparente (92% para el artista) diseñado para ser honesto sobre de dónde sale cada peso.</w:t>
+        <w:t>IM Music es un sello discográfico independiente construido sobre una premisa simple: la industria musical no tiene que elegir entre autenticidad y estructura, entre cultura callejera y estrategia de negocio sofisticada. REBEL LUXURY es esa síntesis — identidad visual radical, contenido con densidad de valor real, y un modelo de distribución transparente (92% para el artista) diseñado para ser honesto sobre de dónde sale cada dólar.</w:t>
       </w:r>
     </w:p>
     <w:p>

</xml_diff>

<commit_message>
fix: alinear capitulo de metodologia IM Music con el deck real de la empresa
Se encontro el deck oficial "_IM music 2026 (1) (1).pdf" en Drive con la
metodologia real (ciclo Insights-Estrategia-Creatividad-Ejecucion-Medir y
optimizar, marco de marca/arquetipo, Metodologia 7 Maletas para campanas).
El capitulo del libro se reescribio para reflejar esto exactamente, en vez
de una version inventada a partir de la descripcion en chat.

Co-Authored-By: Claude Sonnet 5 <noreply@anthropic.com>
Claude-Session: https://claude.ai/code/session_01BGajP5s9F1aLgfyztSAp9Y
</commit_message>
<xml_diff>
--- a/docs/libro/Music_Business_Para_Todos_IM_Music.docx
+++ b/docs/libro/Music_Business_Para_Todos_IM_Music.docx
@@ -7947,189 +7947,244 @@
           <w:rFonts w:ascii="Georgia" w:hAnsi="Georgia"/>
           <w:sz w:val="22"/>
         </w:rPr>
-        <w:t>El Capítulo 17 explicó los pilares de una identidad de marca defendible. Este capítulo explica el proceso — la metodología completa que IM Music usa para construir la marca de un artista antes de producir una sola pieza de contenido. No es una fórmula genérica de "branding" — combina investigación de mercado tradicional con neurociencia y psicología aplicada, para llegar a una estrategia mucho más específica que "define tus colores y tu tono de voz".</w:t>
-      </w:r>
-    </w:p>
-    <w:p>
-      <w:pPr>
-        <w:spacing w:after="160"/>
-      </w:pPr>
-      <w:r>
-        <w:rPr>
-          <w:rFonts w:ascii="Georgia" w:hAnsi="Georgia"/>
-          <w:b/>
-          <w:color w:val="5E17EB"/>
-          <w:sz w:val="22"/>
-        </w:rPr>
-        <w:t>Paso 1: Encontrar el arquetipo</w:t>
-      </w:r>
-    </w:p>
-    <w:p>
-      <w:pPr>
-        <w:spacing w:after="160"/>
-      </w:pPr>
-      <w:r>
-        <w:rPr>
-          <w:rFonts w:ascii="Georgia" w:hAnsi="Georgia"/>
-          <w:sz w:val="22"/>
-        </w:rPr>
-        <w:t>Todo artista tiene, de forma implícita, un arquetipo — un patrón narrativo universal (el rebelde, el sabio, el héroe, el creador, el explorador) que la audiencia reconoce instintivamente, incluso sin poder nombrarlo. El primer paso no es inventar una identidad desde cero — es identificar cuál arquetipo ya vive genuinamente en la personalidad, la historia y la música del artista, y hacerlo consciente y explícito para poder construir sobre él de forma deliberada.</w:t>
-      </w:r>
-    </w:p>
-    <w:p>
-      <w:pPr>
-        <w:spacing w:after="160"/>
-      </w:pPr>
-      <w:r>
-        <w:rPr>
-          <w:rFonts w:ascii="Georgia" w:hAnsi="Georgia"/>
-          <w:b/>
-          <w:color w:val="5E17EB"/>
-          <w:sz w:val="22"/>
-        </w:rPr>
-        <w:t>Paso 2: Conceptualizar la marca</w:t>
-      </w:r>
-    </w:p>
-    <w:p>
-      <w:pPr>
-        <w:spacing w:after="160"/>
-      </w:pPr>
-      <w:r>
-        <w:rPr>
-          <w:rFonts w:ascii="Georgia" w:hAnsi="Georgia"/>
-          <w:sz w:val="22"/>
-        </w:rPr>
-        <w:t>Con el arquetipo identificado, se traduce en un concepto de marca concreto: un nombre, una estética, un lenguaje verbal y visual coherente con ese arquetipo. REBEL LUXURY, la identidad de IM Music, es un ejemplo de este proceso — la síntesis de un arquetipo rebelde con una estética de sofisticación, en lugar de forzar al artista a elegir entre autenticidad callejera y elegancia, como si fueran opuestos.</w:t>
-      </w:r>
-    </w:p>
-    <w:p>
-      <w:pPr>
-        <w:spacing w:after="160"/>
-      </w:pPr>
-      <w:r>
-        <w:rPr>
-          <w:rFonts w:ascii="Georgia" w:hAnsi="Georgia"/>
-          <w:b/>
-          <w:color w:val="5E17EB"/>
-          <w:sz w:val="22"/>
-        </w:rPr>
-        <w:t>Paso 3: Investigación de mercado y perfiles psicológicos de la audiencia</w:t>
-      </w:r>
-    </w:p>
-    <w:p>
-      <w:pPr>
-        <w:spacing w:after="160"/>
-      </w:pPr>
-      <w:r>
-        <w:rPr>
-          <w:rFonts w:ascii="Georgia" w:hAnsi="Georgia"/>
-          <w:sz w:val="22"/>
-        </w:rPr>
-        <w:t>Aquí es donde la metodología va más allá del branding tradicional. No basta con definir un "público objetivo" por edad y ubicación geográfica — se investiga el perfil psicológico real del segmento de audiencia: qué valores sostienen, qué historias consumen, qué comunidades digitales habitan, y qué necesidades emocionales no resueltas los hacen buscar contenido como el que el artista podría ofrecer.</w:t>
-      </w:r>
-    </w:p>
-    <w:p>
-      <w:pPr>
-        <w:spacing w:after="160"/>
-      </w:pPr>
-      <w:r>
-        <w:rPr>
-          <w:rFonts w:ascii="Georgia" w:hAnsi="Georgia"/>
-          <w:b/>
-          <w:color w:val="5E17EB"/>
-          <w:sz w:val="22"/>
-        </w:rPr>
-        <w:t>Paso 4: Sesgos cognitivos e intereses específicos alineados con el arquetipo</w:t>
-      </w:r>
-    </w:p>
-    <w:p>
-      <w:pPr>
-        <w:spacing w:after="160"/>
-      </w:pPr>
-      <w:r>
-        <w:rPr>
-          <w:rFonts w:ascii="Georgia" w:hAnsi="Georgia"/>
-          <w:sz w:val="22"/>
-        </w:rPr>
-        <w:t>Este es el paso distintivo de la metodología: identificar los sesgos cognitivos específicos de esa audiencia (por ejemplo, el sesgo de confirmación hacia narrativas de superación, o la aversión a la pérdida frente a oportunidades percibidas como limitadas) y los intereses concretos — no genéricos — que están más alineados con el arquetipo, el concepto de marca, y la identidad del artista. Esto convierte una audiencia abstracta ("personas de 18-30 años interesadas en música urbana") en un perfil psicográfico accionable: qué gatillos de atención funcionan, qué objeciones hay que resolver, y qué lenguaje específico resuena de verdad.</w:t>
-      </w:r>
-    </w:p>
-    <w:p>
-      <w:pPr>
-        <w:spacing w:after="160"/>
-      </w:pPr>
-      <w:r>
-        <w:rPr>
-          <w:rFonts w:ascii="Georgia" w:hAnsi="Georgia"/>
-          <w:b/>
-          <w:color w:val="5E17EB"/>
-          <w:sz w:val="22"/>
-        </w:rPr>
-        <w:t>Paso 5: Estrategia de marketing basada en la marca, no al revés</w:t>
-      </w:r>
-    </w:p>
-    <w:p>
-      <w:pPr>
-        <w:spacing w:after="160"/>
-      </w:pPr>
-      <w:r>
-        <w:rPr>
-          <w:rFonts w:ascii="Georgia" w:hAnsi="Georgia"/>
-          <w:sz w:val="22"/>
-        </w:rPr>
-        <w:t>Con el arquetipo, el concepto y el perfil psicográfico definidos, recién ahí se construye la estrategia de marketing — nunca antes. Cada pieza de contenido, cada campaña, cada colaboración se diseña para reforzar esa identidad específica frente a esa audiencia específica, en lugar de perseguir tendencias genéricas que cualquier otro artista podría replicar igual de bien.</w:t>
-      </w:r>
-    </w:p>
-    <w:p>
-      <w:pPr>
-        <w:spacing w:after="160"/>
-      </w:pPr>
-      <w:r>
-        <w:rPr>
-          <w:rFonts w:ascii="Georgia" w:hAnsi="Georgia"/>
-          <w:b/>
-          <w:color w:val="5E17EB"/>
-          <w:sz w:val="22"/>
-        </w:rPr>
-        <w:t>Paso 6: Contenido personalizado — digital y tradicional</w:t>
-      </w:r>
-    </w:p>
-    <w:p>
-      <w:pPr>
-        <w:spacing w:after="160"/>
-      </w:pPr>
-      <w:r>
-        <w:rPr>
-          <w:rFonts w:ascii="Georgia" w:hAnsi="Georgia"/>
-          <w:sz w:val="22"/>
-        </w:rPr>
-        <w:t>La estrategia se traduce en contenido totalmente personalizado para ese arquetipo y esa audiencia, distribuido tanto en canales digitales (redes sociales, streaming, contenido educativo) como tradicionales (prensa, radio, eventos físicos, alianzas locales), según dónde esa audiencia específica realmente esté presente — no según qué canal esté de moda.</w:t>
-      </w:r>
-    </w:p>
-    <w:p>
-      <w:pPr>
-        <w:spacing w:after="160"/>
-      </w:pPr>
-      <w:r>
-        <w:rPr>
-          <w:rFonts w:ascii="Georgia" w:hAnsi="Georgia"/>
-          <w:b/>
-          <w:color w:val="5E17EB"/>
-          <w:sz w:val="22"/>
-        </w:rPr>
-        <w:t>Paso 7: Conversión hacia objetivos claros</w:t>
-      </w:r>
-    </w:p>
-    <w:p>
-      <w:pPr>
-        <w:spacing w:after="160"/>
-      </w:pPr>
-      <w:r>
-        <w:rPr>
-          <w:rFonts w:ascii="Georgia" w:hAnsi="Georgia"/>
-          <w:sz w:val="22"/>
-        </w:rPr>
-        <w:t>Todo el proceso anterior existe para llevar a la audiencia hacia objetivos de negocio medibles y específicos, no solo "más seguidores":</w:t>
+        <w:t>El Capítulo 17 explicó los pilares de una identidad de marca defendible. Este capítulo explica el proceso real que usa IM Music para construir la marca de un artista antes de producir una sola pieza de contenido — no una fórmula genérica de "branding", sino la metodología que sostiene el trabajo real del sello, resumida en una frase que la define: *conectar con la mente más allá de los datos*, usando neurociencia y psicología aplicada al marketing en la industria musical.</w:t>
+      </w:r>
+    </w:p>
+    <w:p>
+      <w:pPr>
+        <w:spacing w:after="160"/>
+      </w:pPr>
+      <w:r>
+        <w:rPr>
+          <w:rFonts w:ascii="Georgia" w:hAnsi="Georgia"/>
+          <w:b/>
+          <w:color w:val="5E17EB"/>
+          <w:sz w:val="22"/>
+        </w:rPr>
+        <w:t>El proceso central: un ciclo de cinco pasos</w:t>
+      </w:r>
+    </w:p>
+    <w:p>
+      <w:pPr>
+        <w:spacing w:after="160"/>
+      </w:pPr>
+      <w:r>
+        <w:rPr>
+          <w:rFonts w:ascii="Georgia" w:hAnsi="Georgia"/>
+          <w:sz w:val="22"/>
+        </w:rPr>
+        <w:t>Toda la metodología se construye sobre una línea de tiempo cíclica — no lineal, no de una sola vez, sino un proceso que se repite y se refina con cada iteración:</w:t>
+      </w:r>
+    </w:p>
+    <w:p>
+      <w:pPr>
+        <w:pStyle w:val="ListNumber"/>
+      </w:pPr>
+      <w:r>
+        <w:rPr>
+          <w:rFonts w:ascii="Georgia" w:hAnsi="Georgia"/>
+          <w:b/>
+          <w:color w:val="5E17EB"/>
+          <w:sz w:val="22"/>
+        </w:rPr>
+        <w:t>Insights</w:t>
+      </w:r>
+      <w:r>
+        <w:rPr>
+          <w:rFonts w:ascii="Georgia" w:hAnsi="Georgia"/>
+          <w:sz w:val="22"/>
+        </w:rPr>
+        <w:t xml:space="preserve"> — investigación de datos y comprensión profunda del comportamiento del consumidor, las tendencias del mercado, y los demás factores que influyen en las decisiones comerciales. Este paso es, literalmente, la base de toda la metodología: sin insights reales, cualquier decisión posterior es una suposición disfrazada de estrategia.</w:t>
+      </w:r>
+    </w:p>
+    <w:p>
+      <w:pPr>
+        <w:pStyle w:val="ListNumber"/>
+      </w:pPr>
+      <w:r>
+        <w:rPr>
+          <w:rFonts w:ascii="Georgia" w:hAnsi="Georgia"/>
+          <w:b/>
+          <w:color w:val="5E17EB"/>
+          <w:sz w:val="22"/>
+        </w:rPr>
+        <w:t>Estrategia</w:t>
+      </w:r>
+      <w:r>
+        <w:rPr>
+          <w:rFonts w:ascii="Georgia" w:hAnsi="Georgia"/>
+          <w:sz w:val="22"/>
+        </w:rPr>
+        <w:t xml:space="preserve"> — con esos insights, se construye un mapa de estrategia estructurado y medible, identificando las oportunidades específicas que agregan valor real al proyecto del artista, a partir de un proceso de descubrimiento que entiende en detalle el estado actual de ese proyecto musical.</w:t>
+      </w:r>
+    </w:p>
+    <w:p>
+      <w:pPr>
+        <w:pStyle w:val="ListNumber"/>
+      </w:pPr>
+      <w:r>
+        <w:rPr>
+          <w:rFonts w:ascii="Georgia" w:hAnsi="Georgia"/>
+          <w:b/>
+          <w:color w:val="5E17EB"/>
+          <w:sz w:val="22"/>
+        </w:rPr>
+        <w:t>Creatividad</w:t>
+      </w:r>
+      <w:r>
+        <w:rPr>
+          <w:rFonts w:ascii="Georgia" w:hAnsi="Georgia"/>
+          <w:sz w:val="22"/>
+        </w:rPr>
+        <w:t xml:space="preserve"> — el desarrollo de conceptos, piezas y narrativas que van a ejecutar la estrategia definida.</w:t>
+      </w:r>
+    </w:p>
+    <w:p>
+      <w:pPr>
+        <w:pStyle w:val="ListNumber"/>
+      </w:pPr>
+      <w:r>
+        <w:rPr>
+          <w:rFonts w:ascii="Georgia" w:hAnsi="Georgia"/>
+          <w:b/>
+          <w:color w:val="5E17EB"/>
+          <w:sz w:val="22"/>
+        </w:rPr>
+        <w:t>Ejecución</w:t>
+      </w:r>
+      <w:r>
+        <w:rPr>
+          <w:rFonts w:ascii="Georgia" w:hAnsi="Georgia"/>
+          <w:sz w:val="22"/>
+        </w:rPr>
+        <w:t xml:space="preserve"> — la producción y publicación real del contenido y las campañas, corriendo en paralelo con la fase de creatividad.</w:t>
+      </w:r>
+    </w:p>
+    <w:p>
+      <w:pPr>
+        <w:pStyle w:val="ListNumber"/>
+      </w:pPr>
+      <w:r>
+        <w:rPr>
+          <w:rFonts w:ascii="Georgia" w:hAnsi="Georgia"/>
+          <w:b/>
+          <w:color w:val="5E17EB"/>
+          <w:sz w:val="22"/>
+        </w:rPr>
+        <w:t>Medir y optimizar</w:t>
+      </w:r>
+      <w:r>
+        <w:rPr>
+          <w:rFonts w:ascii="Georgia" w:hAnsi="Georgia"/>
+          <w:sz w:val="22"/>
+        </w:rPr>
+        <w:t xml:space="preserve"> — evaluar qué funcionó y qué no, con datos reales, y volver a alimentar esos hallazgos al primer paso (Insights) para el siguiente ciclo.</w:t>
+      </w:r>
+    </w:p>
+    <w:p>
+      <w:pPr>
+        <w:spacing w:after="160"/>
+      </w:pPr>
+      <w:r>
+        <w:rPr>
+          <w:rFonts w:ascii="Georgia" w:hAnsi="Georgia"/>
+          <w:b/>
+          <w:color w:val="5E17EB"/>
+          <w:sz w:val="22"/>
+        </w:rPr>
+        <w:t>Dentro de este proceso: marco estratégico de marca, arquetipo y concepto</w:t>
+      </w:r>
+    </w:p>
+    <w:p>
+      <w:pPr>
+        <w:spacing w:after="160"/>
+      </w:pPr>
+      <w:r>
+        <w:rPr>
+          <w:rFonts w:ascii="Georgia" w:hAnsi="Georgia"/>
+          <w:sz w:val="22"/>
+        </w:rPr>
+        <w:t>La construcción de identidad de marca es uno de los entregables centrales de la fase de Estrategia. Aquí es donde se define el arquetipo del artista — un patrón narrativo universal (el rebelde, el sabio, el héroe, el creador) que la audiencia reconoce instintivamente — y se traduce en un concepto de marca concreto: nombre, estética, lenguaje verbal y visual coherente. REBEL LUXURY, la identidad de IM Music, nació exactamente de este proceso — la síntesis de un arquetipo rebelde con una estética de sofisticación, en lugar de forzar al artista a elegir entre autenticidad callejera y elegancia, como si fueran opuestos.</w:t>
+      </w:r>
+    </w:p>
+    <w:p>
+      <w:pPr>
+        <w:spacing w:after="160"/>
+      </w:pPr>
+      <w:r>
+        <w:rPr>
+          <w:rFonts w:ascii="Georgia" w:hAnsi="Georgia"/>
+          <w:sz w:val="22"/>
+        </w:rPr>
+        <w:t>Este trabajo de marca no ocurre aislado — se acompaña de diseño gráfico y creación de contenido, campañas digitales de reconocimiento y posicionamiento, y materiales y toolkits de marca que le dan al artista un sistema visual y verbal completo y reutilizable.</w:t>
+      </w:r>
+    </w:p>
+    <w:p>
+      <w:pPr>
+        <w:spacing w:after="160"/>
+      </w:pPr>
+      <w:r>
+        <w:rPr>
+          <w:rFonts w:ascii="Georgia" w:hAnsi="Georgia"/>
+          <w:b/>
+          <w:color w:val="5E17EB"/>
+          <w:sz w:val="22"/>
+        </w:rPr>
+        <w:t>Por qué neurociencia y psicología son el eje, no un adorno</w:t>
+      </w:r>
+    </w:p>
+    <w:p>
+      <w:pPr>
+        <w:spacing w:after="160"/>
+      </w:pPr>
+      <w:r>
+        <w:rPr>
+          <w:rFonts w:ascii="Georgia" w:hAnsi="Georgia"/>
+          <w:sz w:val="22"/>
+        </w:rPr>
+        <w:t>La fase de Insights no se limita a datos demográficos superficiales. Busca entender el comportamiento real de la audiencia — qué la mueve a prestar atención, qué historias consume, y qué patrones psicológicos (incluyendo sesgos cognitivos específicos del segmento) hacen que un mensaje conecte de verdad en lugar de pasar desapercibido. Esta comprensión profunda es lo que permite que las estrategias de marketing y posicionamiento de marca sean altamente persuasivas — no en el sentido manipulador (Capítulo 15 ya trazó esa línea), sino en el sentido de comunicar con precisión a quien realmente está escuchando.</w:t>
+      </w:r>
+    </w:p>
+    <w:p>
+      <w:pPr>
+        <w:spacing w:after="160"/>
+      </w:pPr>
+      <w:r>
+        <w:rPr>
+          <w:rFonts w:ascii="Georgia" w:hAnsi="Georgia"/>
+          <w:b/>
+          <w:color w:val="5E17EB"/>
+          <w:sz w:val="22"/>
+        </w:rPr>
+        <w:t>Campañas de conversión: la Metodología 7 Maletas</w:t>
+      </w:r>
+    </w:p>
+    <w:p>
+      <w:pPr>
+        <w:spacing w:after="160"/>
+      </w:pPr>
+      <w:r>
+        <w:rPr>
+          <w:rFonts w:ascii="Georgia" w:hAnsi="Georgia"/>
+          <w:sz w:val="22"/>
+        </w:rPr>
+        <w:t xml:space="preserve">Para la creación estratégica de campañas específicamente, IM Music usa un proceso propio llamado </w:t>
+      </w:r>
+      <w:r>
+        <w:rPr>
+          <w:rFonts w:ascii="Georgia" w:hAnsi="Georgia"/>
+          <w:b/>
+          <w:color w:val="5E17EB"/>
+          <w:sz w:val="22"/>
+        </w:rPr>
+        <w:t>Metodología 7 Maletas</w:t>
+      </w:r>
+      <w:r>
+        <w:rPr>
+          <w:rFonts w:ascii="Georgia" w:hAnsi="Georgia"/>
+          <w:sz w:val="22"/>
+        </w:rPr>
+        <w:t>, que incluye:</w:t>
       </w:r>
     </w:p>
     <w:p>
@@ -8139,18 +8194,9 @@
       <w:r>
         <w:rPr>
           <w:rFonts w:ascii="Georgia" w:hAnsi="Georgia"/>
-          <w:b/>
-          <w:color w:val="5E17EB"/>
-          <w:sz w:val="22"/>
-        </w:rPr>
-        <w:t>Tráfico</w:t>
-      </w:r>
-      <w:r>
-        <w:rPr>
-          <w:rFonts w:ascii="Georgia" w:hAnsi="Georgia"/>
-          <w:sz w:val="22"/>
-        </w:rPr>
-        <w:t xml:space="preserve"> hacia canales propios (sitio web, catálogo de streaming)</w:t>
+          <w:sz w:val="22"/>
+        </w:rPr>
+        <w:t>Embudos de conversión y páginas de aterrizaje altamente persuasivas</w:t>
       </w:r>
     </w:p>
     <w:p>
@@ -8160,18 +8206,9 @@
       <w:r>
         <w:rPr>
           <w:rFonts w:ascii="Georgia" w:hAnsi="Georgia"/>
-          <w:b/>
-          <w:color w:val="5E17EB"/>
-          <w:sz w:val="22"/>
-        </w:rPr>
-        <w:t>Oyentes</w:t>
-      </w:r>
-      <w:r>
-        <w:rPr>
-          <w:rFonts w:ascii="Georgia" w:hAnsi="Georgia"/>
-          <w:sz w:val="22"/>
-        </w:rPr>
-        <w:t xml:space="preserve"> recurrentes, no solo escuchas puntuales</w:t>
+          <w:sz w:val="22"/>
+        </w:rPr>
+        <w:t>Campañas de remarketing (volver a impactar a quien ya mostró interés)</w:t>
       </w:r>
     </w:p>
     <w:p>
@@ -8181,18 +8218,75 @@
       <w:r>
         <w:rPr>
           <w:rFonts w:ascii="Georgia" w:hAnsi="Georgia"/>
-          <w:b/>
-          <w:color w:val="5E17EB"/>
-          <w:sz w:val="22"/>
-        </w:rPr>
-        <w:t>Comunidad</w:t>
-      </w:r>
-      <w:r>
-        <w:rPr>
-          <w:rFonts w:ascii="Georgia" w:hAnsi="Georgia"/>
-          <w:sz w:val="22"/>
-        </w:rPr>
-        <w:t xml:space="preserve"> activa (Discord, grupos de mensajería, listas de correo)</w:t>
+          <w:sz w:val="22"/>
+        </w:rPr>
+        <w:t>Campañas promocionales dirigidas a objetivos específicos</w:t>
+      </w:r>
+    </w:p>
+    <w:p>
+      <w:pPr>
+        <w:spacing w:after="160"/>
+      </w:pPr>
+      <w:r>
+        <w:rPr>
+          <w:rFonts w:ascii="Georgia" w:hAnsi="Georgia"/>
+          <w:b/>
+          <w:color w:val="5E17EB"/>
+          <w:sz w:val="22"/>
+        </w:rPr>
+        <w:t>Conversión hacia objetivos claros</w:t>
+      </w:r>
+    </w:p>
+    <w:p>
+      <w:pPr>
+        <w:spacing w:after="160"/>
+      </w:pPr>
+      <w:r>
+        <w:rPr>
+          <w:rFonts w:ascii="Georgia" w:hAnsi="Georgia"/>
+          <w:sz w:val="22"/>
+        </w:rPr>
+        <w:t>Todo el proceso anterior existe para llevar a la audiencia hacia objetivos de negocio medibles y específicos, no solo "más seguidores": tráfico hacia canales propios, oyentes recurrentes, comunidad activa, base de datos propia, asistencia real a eventos, colaboraciones con marcas alineadas con la identidad, y merchandising propio que extiende la marca más allá del contenido digital.</w:t>
+      </w:r>
+    </w:p>
+    <w:p>
+      <w:pPr>
+        <w:spacing w:after="160"/>
+      </w:pPr>
+      <w:r>
+        <w:rPr>
+          <w:rFonts w:ascii="Georgia" w:hAnsi="Georgia"/>
+          <w:b/>
+          <w:color w:val="5E17EB"/>
+          <w:sz w:val="22"/>
+        </w:rPr>
+        <w:t>Acompañamiento más allá del contenido</w:t>
+      </w:r>
+    </w:p>
+    <w:p>
+      <w:pPr>
+        <w:spacing w:after="160"/>
+      </w:pPr>
+      <w:r>
+        <w:rPr>
+          <w:rFonts w:ascii="Georgia" w:hAnsi="Georgia"/>
+          <w:sz w:val="22"/>
+        </w:rPr>
+        <w:t>La metodología no se detiene en marketing y contenido. Incluye asesoría y acompañamiento personalizado y constante, integrado con la misión y visión de cada proyecto musical, además de alianzas estratégicas para financiamiento, producción, masterización, y asesoría legal especializada en propiedad intelectual — un ecosistema completo, no servicios aislados.</w:t>
+      </w:r>
+    </w:p>
+    <w:p>
+      <w:pPr>
+        <w:spacing w:after="160"/>
+      </w:pPr>
+      <w:r>
+        <w:rPr>
+          <w:rFonts w:ascii="Georgia" w:hAnsi="Georgia"/>
+          <w:b/>
+          <w:color w:val="5E17EB"/>
+          <w:sz w:val="22"/>
+        </w:rPr>
+        <w:t>Puntos clave del capítulo</w:t>
       </w:r>
     </w:p>
     <w:p>
@@ -8202,18 +8296,9 @@
       <w:r>
         <w:rPr>
           <w:rFonts w:ascii="Georgia" w:hAnsi="Georgia"/>
-          <w:b/>
-          <w:color w:val="5E17EB"/>
-          <w:sz w:val="22"/>
-        </w:rPr>
-        <w:t>Base de datos</w:t>
-      </w:r>
-      <w:r>
-        <w:rPr>
-          <w:rFonts w:ascii="Georgia" w:hAnsi="Georgia"/>
-          <w:sz w:val="22"/>
-        </w:rPr>
-        <w:t xml:space="preserve"> propia, que no depende de ningún algoritmo externo</w:t>
+          <w:sz w:val="22"/>
+        </w:rPr>
+        <w:t>La metodología completa opera como un ciclo de cinco pasos que se repite y se refina: Insights, Estrategia, Creatividad, Ejecución, y Medir y optimizar.</w:t>
       </w:r>
     </w:p>
     <w:p>
@@ -8223,18 +8308,9 @@
       <w:r>
         <w:rPr>
           <w:rFonts w:ascii="Georgia" w:hAnsi="Georgia"/>
-          <w:b/>
-          <w:color w:val="5E17EB"/>
-          <w:sz w:val="22"/>
-        </w:rPr>
-        <w:t>Eventos</w:t>
-      </w:r>
-      <w:r>
-        <w:rPr>
-          <w:rFonts w:ascii="Georgia" w:hAnsi="Georgia"/>
-          <w:sz w:val="22"/>
-        </w:rPr>
-        <w:t xml:space="preserve"> con asistencia real, no solo alcance digital</w:t>
+          <w:sz w:val="22"/>
+        </w:rPr>
+        <w:t>El marco estratégico de marca (arquetipo y concepto) se construye dentro de la fase de Estrategia, apoyado en neurociencia y psicología aplicadas al comportamiento real de la audiencia, no en suposiciones genéricas.</w:t>
       </w:r>
     </w:p>
     <w:p>
@@ -8244,115 +8320,9 @@
       <w:r>
         <w:rPr>
           <w:rFonts w:ascii="Georgia" w:hAnsi="Georgia"/>
-          <w:b/>
-          <w:color w:val="5E17EB"/>
-          <w:sz w:val="22"/>
-        </w:rPr>
-        <w:t>Colaboraciones con marcas alineadas</w:t>
-      </w:r>
-      <w:r>
-        <w:rPr>
-          <w:rFonts w:ascii="Georgia" w:hAnsi="Georgia"/>
-          <w:sz w:val="22"/>
-        </w:rPr>
-        <w:t xml:space="preserve"> con el arquetipo y los valores de la identidad</w:t>
-      </w:r>
-    </w:p>
-    <w:p>
-      <w:pPr>
-        <w:pStyle w:val="ListBullet"/>
-      </w:pPr>
-      <w:r>
-        <w:rPr>
-          <w:rFonts w:ascii="Georgia" w:hAnsi="Georgia"/>
-          <w:b/>
-          <w:color w:val="5E17EB"/>
-          <w:sz w:val="22"/>
-        </w:rPr>
-        <w:t>Merchandising propio</w:t>
-      </w:r>
-      <w:r>
-        <w:rPr>
-          <w:rFonts w:ascii="Georgia" w:hAnsi="Georgia"/>
-          <w:sz w:val="22"/>
-        </w:rPr>
-        <w:t xml:space="preserve"> que extiende la identidad más allá del contenido digital</w:t>
-      </w:r>
-    </w:p>
-    <w:p>
-      <w:pPr>
-        <w:spacing w:after="160"/>
-      </w:pPr>
-      <w:r>
-        <w:rPr>
-          <w:rFonts w:ascii="Georgia" w:hAnsi="Georgia"/>
-          <w:b/>
-          <w:color w:val="5E17EB"/>
-          <w:sz w:val="22"/>
-        </w:rPr>
-        <w:t>Por qué esta metodología funciona mejor que el branding genérico</w:t>
-      </w:r>
-    </w:p>
-    <w:p>
-      <w:pPr>
-        <w:spacing w:after="160"/>
-      </w:pPr>
-      <w:r>
-        <w:rPr>
-          <w:rFonts w:ascii="Georgia" w:hAnsi="Georgia"/>
-          <w:sz w:val="22"/>
-        </w:rPr>
-        <w:t>La mayoría de estrategias de marca se detienen en el Paso 2: definir un logo, una paleta de colores, un tono de voz. Sin los pasos 3 a 5 — investigación psicográfica real, identificación de sesgos cognitivos específicos, y una estrategia de marketing derivada de esa investigación, no al revés — la identidad de marca queda bonita pero desconectada de lo que realmente mueve a la audiencia a prestar atención, confiar, y eventualmente convertirse en oyente, comunidad, o cliente.</w:t>
-      </w:r>
-    </w:p>
-    <w:p>
-      <w:pPr>
-        <w:spacing w:after="160"/>
-      </w:pPr>
-      <w:r>
-        <w:rPr>
-          <w:rFonts w:ascii="Georgia" w:hAnsi="Georgia"/>
-          <w:b/>
-          <w:color w:val="5E17EB"/>
-          <w:sz w:val="22"/>
-        </w:rPr>
-        <w:t>Puntos clave del capítulo</w:t>
-      </w:r>
-    </w:p>
-    <w:p>
-      <w:pPr>
-        <w:pStyle w:val="ListBullet"/>
-      </w:pPr>
-      <w:r>
-        <w:rPr>
-          <w:rFonts w:ascii="Georgia" w:hAnsi="Georgia"/>
-          <w:sz w:val="22"/>
-        </w:rPr>
-        <w:t>La metodología completa de construcción de marca tiene siete pasos: arquetipo, conceptualización, investigación de mercado y perfiles psicológicos, sesgos cognitivos e intereses específicos, estrategia de marketing basada en la marca, contenido personalizado, y conversión a objetivos claros.</w:t>
-      </w:r>
-    </w:p>
-    <w:p>
-      <w:pPr>
-        <w:pStyle w:val="ListBullet"/>
-      </w:pPr>
-      <w:r>
-        <w:rPr>
-          <w:rFonts w:ascii="Georgia" w:hAnsi="Georgia"/>
-          <w:sz w:val="22"/>
-        </w:rPr>
-        <w:t>Ir más allá de la investigación de mercado tradicional hacia sesgos cognitivos e intereses específicos es lo que distingue una identidad de marca genérica de una que realmente conecta.</w:t>
-      </w:r>
-    </w:p>
-    <w:p>
-      <w:pPr>
-        <w:pStyle w:val="ListBullet"/>
-      </w:pPr>
-      <w:r>
-        <w:rPr>
-          <w:rFonts w:ascii="Georgia" w:hAnsi="Georgia"/>
-          <w:sz w:val="22"/>
-        </w:rPr>
-        <w:t>El objetivo final nunca es solo "más seguidores" — es conversión medible: tráfico, oyentes, comunidad, base de datos, eventos, colaboraciones de marca y merchandising propio.</w:t>
+          <w:sz w:val="22"/>
+        </w:rPr>
+        <w:t>Las campañas de conversión siguen un proceso propio (Metodología 7 Maletas): embudos de conversión, páginas de aterrizaje persuasivas, remarketing y campañas promocionales — todo apuntando a objetivos medibles: tráfico, oyentes, comunidad, base de datos, eventos, marcas aliadas y merchandising propio.</w:t>
       </w:r>
     </w:p>
     <w:p>

</xml_diff>

<commit_message>
feat: portada del libro como imagen real con identidad de marca
Genera portada_music_business.png (1800x2700, violeta #5E17EB, logo IM
Music en blanco, Sceageus para el titulo, Anton para subtitulos) y la
inserta como primera pagina a sangre completa en el Word, en su propia
seccion sin margenes.

Co-Authored-By: Claude Sonnet 5 <noreply@anthropic.com>
Claude-Session: https://claude.ai/code/session_01BGajP5s9F1aLgfyztSAp9Y
</commit_message>
<xml_diff>
--- a/docs/libro/Music_Business_Para_Todos_IM_Music.docx
+++ b/docs/libro/Music_Business_Para_Todos_IM_Music.docx
@@ -2,135 +2,59 @@
 <file path=word/document.xml><?xml version="1.0" encoding="utf-8"?>
 <w:document xmlns:wpc="http://schemas.microsoft.com/office/word/2010/wordprocessingCanvas" xmlns:mo="http://schemas.microsoft.com/office/mac/office/2008/main" xmlns:mc="http://schemas.openxmlformats.org/markup-compatibility/2006" xmlns:mv="urn:schemas-microsoft-com:mac:vml" xmlns:o="urn:schemas-microsoft-com:office:office" xmlns:r="http://schemas.openxmlformats.org/officeDocument/2006/relationships" xmlns:m="http://schemas.openxmlformats.org/officeDocument/2006/math" xmlns:v="urn:schemas-microsoft-com:vml" xmlns:wp14="http://schemas.microsoft.com/office/word/2010/wordprocessingDrawing" xmlns:wp="http://schemas.openxmlformats.org/drawingml/2006/wordprocessingDrawing" xmlns:w10="urn:schemas-microsoft-com:office:word" xmlns:w="http://schemas.openxmlformats.org/wordprocessingml/2006/main" xmlns:w14="http://schemas.microsoft.com/office/word/2010/wordml" xmlns:wpg="http://schemas.microsoft.com/office/word/2010/wordprocessingGroup" xmlns:wpi="http://schemas.microsoft.com/office/word/2010/wordprocessingInk" xmlns:wne="http://schemas.microsoft.com/office/word/2006/wordml" xmlns:wps="http://schemas.microsoft.com/office/word/2010/wordprocessingShape" mc:Ignorable="w14 wp14">
   <w:body>
-    <w:tbl>
-      <w:tblPr>
-        <w:tblW w:type="auto" w:w="0"/>
-        <w:jc w:val="center"/>
-        <w:tblLook w:firstColumn="1" w:firstRow="1" w:lastColumn="0" w:lastRow="0" w:noHBand="0" w:noVBand="1" w:val="04A0"/>
-        <w:tblLayout w:type="fixed"/>
-      </w:tblPr>
-      <w:tblGrid>
-        <w:gridCol w:w="4206240"/>
-      </w:tblGrid>
-      <w:tblGrid>
-        <w:gridCol w:w="6624"/>
-      </w:tblGrid>
-      <w:tr>
-        <w:trPr>
-          <w:trHeight w:val="6949440" w:hRule="exact"/>
-        </w:trPr>
-        <w:tc>
-          <w:tcPr>
-            <w:tcW w:type="dxa" w:w="6624"/>
-            <w:shd w:val="clear" w:color="auto" w:fill="5E17EB"/>
-            <w:vAlign w:val="center"/>
-          </w:tcPr>
-          <w:p>
-            <w:r/>
-          </w:p>
-          <w:p/>
-          <w:p/>
-          <w:p/>
-          <w:p/>
-          <w:p/>
-          <w:p/>
-          <w:p>
-            <w:pPr>
-              <w:spacing w:before="0" w:after="600"/>
-              <w:jc w:val="center"/>
-            </w:pPr>
-            <w:r>
-              <w:rPr>
-                <w:rFonts w:ascii="Georgia" w:hAnsi="Georgia"/>
-                <w:b/>
-                <w:color w:val="F2EDE5"/>
-                <w:sz w:val="40"/>
-              </w:rPr>
-              <w:t>IM MUSIC</w:t>
-            </w:r>
-          </w:p>
-          <w:p>
-            <w:pPr>
-              <w:spacing w:before="0" w:after="0"/>
-              <w:jc w:val="center"/>
-            </w:pPr>
-            <w:r>
-              <w:rPr>
-                <w:rFonts w:ascii="Bahnschrift" w:hAnsi="Bahnschrift"/>
-                <w:b/>
-                <w:color w:val="FFFFFF"/>
-                <w:sz w:val="92"/>
-              </w:rPr>
-              <w:t>MUSIC BUSINESS</w:t>
-            </w:r>
-          </w:p>
-          <w:p>
-            <w:pPr>
-              <w:spacing w:before="0" w:after="400"/>
-              <w:jc w:val="center"/>
-            </w:pPr>
-            <w:r>
-              <w:rPr>
-                <w:rFonts w:ascii="Bahnschrift" w:hAnsi="Bahnschrift"/>
-                <w:b/>
-                <w:color w:val="FFFFFF"/>
-                <w:sz w:val="92"/>
-              </w:rPr>
-              <w:t>PARA TODOS</w:t>
-            </w:r>
-          </w:p>
-          <w:p>
-            <w:pPr>
-              <w:spacing w:before="0" w:after="4000"/>
-              <w:jc w:val="center"/>
-            </w:pPr>
-            <w:r>
-              <w:rPr>
-                <w:rFonts w:ascii="Georgia" w:hAnsi="Georgia"/>
-                <w:b w:val="0"/>
-                <w:color w:val="F2EDE5"/>
-                <w:sz w:val="32"/>
-              </w:rPr>
-              <w:t>La guía REBEL LUXURY de la industria musical</w:t>
-            </w:r>
-          </w:p>
-          <w:p>
-            <w:pPr>
-              <w:spacing w:before="0" w:after="0"/>
-              <w:jc w:val="center"/>
-            </w:pPr>
-            <w:r>
-              <w:rPr>
-                <w:rFonts w:ascii="Georgia" w:hAnsi="Georgia"/>
-                <w:b w:val="0"/>
-                <w:color w:val="F2EDE5"/>
-                <w:sz w:val="26"/>
-              </w:rPr>
-              <w:t>No lanzamos música. Jaqueamos mentes.</w:t>
-            </w:r>
-          </w:p>
-          <w:p>
-            <w:pPr>
-              <w:spacing w:before="0" w:after="0"/>
-              <w:jc w:val="center"/>
-            </w:pPr>
-            <w:r>
-              <w:rPr>
-                <w:rFonts w:ascii="Georgia" w:hAnsi="Georgia"/>
-                <w:b w:val="0"/>
-                <w:color w:val="F2EDE5"/>
-                <w:sz w:val="24"/>
-              </w:rPr>
-              <w:t>@immusicsello</w:t>
-            </w:r>
-          </w:p>
-        </w:tc>
-      </w:tr>
-    </w:tbl>
+    <w:p>
+      <w:pPr>
+        <w:spacing w:before="0" w:after="0"/>
+      </w:pPr>
+      <w:r>
+        <w:drawing>
+          <wp:inline xmlns:a="http://schemas.openxmlformats.org/drawingml/2006/main" xmlns:pic="http://schemas.openxmlformats.org/drawingml/2006/picture">
+            <wp:extent cx="5486400" cy="8229600"/>
+            <wp:docPr id="1" name="Picture 1"/>
+            <wp:cNvGraphicFramePr>
+              <a:graphicFrameLocks noChangeAspect="1"/>
+            </wp:cNvGraphicFramePr>
+            <a:graphic>
+              <a:graphicData uri="http://schemas.openxmlformats.org/drawingml/2006/picture">
+                <pic:pic>
+                  <pic:nvPicPr>
+                    <pic:cNvPr id="0" name="portada_music_business.png"/>
+                    <pic:cNvPicPr/>
+                  </pic:nvPicPr>
+                  <pic:blipFill>
+                    <a:blip r:embed="rId9"/>
+                    <a:stretch>
+                      <a:fillRect/>
+                    </a:stretch>
+                  </pic:blipFill>
+                  <pic:spPr>
+                    <a:xfrm>
+                      <a:off x="0" y="0"/>
+                      <a:ext cx="5486400" cy="8229600"/>
+                    </a:xfrm>
+                    <a:prstGeom prst="rect"/>
+                  </pic:spPr>
+                </pic:pic>
+              </a:graphicData>
+            </a:graphic>
+          </wp:inline>
+        </w:drawing>
+      </w:r>
+    </w:p>
     <w:p>
       <w:r>
         <w:br w:type="page"/>
       </w:r>
+    </w:p>
+    <w:p>
+      <w:pPr>
+        <w:sectPr>
+          <w:pgSz w:w="8640" w:h="12960"/>
+          <w:pgMar w:top="0" w:right="0" w:bottom="0" w:left="0" w:header="720" w:footer="720" w:gutter="0"/>
+          <w:cols w:space="720"/>
+          <w:docGrid w:linePitch="360"/>
+        </w:sectPr>
+      </w:pPr>
     </w:p>
     <w:p>
       <w:r>

</xml_diff>